<commit_message>
Tests de la API
Se han realizado tests automatizados para la API y el apartado de Pruebas de la documentación.  Esto se ha hecho con la ayuda del TestClient aportado por FastAPI y `pytest`. En la documentación está detallado para que es cada test. Se ha actualizado el requirements.txt con lo utilizado también.
</commit_message>
<xml_diff>
--- a/docs/TFG_Documentacion.docx
+++ b/docs/TFG_Documentacion.docx
@@ -8035,44 +8035,19 @@
       <w:r>
         <w:t xml:space="preserve"> (</w:t>
       </w:r>
-      <w:proofErr w:type="spellStart"/>
       <w:r>
         <w:rPr>
           <w:i/>
           <w:iCs/>
         </w:rPr>
-        <w:t>Anatomical</w:t>
-      </w:r>
-      <w:proofErr w:type="spellEnd"/>
+        <w:t>Anatomical T</w:t>
+      </w:r>
       <w:r>
         <w:rPr>
           <w:i/>
           <w:iCs/>
         </w:rPr>
-        <w:t xml:space="preserve"> </w:t>
-      </w:r>
-      <w:proofErr w:type="spellStart"/>
-      <w:r>
-        <w:rPr>
-          <w:i/>
-          <w:iCs/>
-        </w:rPr>
-        <w:t>T</w:t>
-      </w:r>
-      <w:r>
-        <w:rPr>
-          <w:i/>
-          <w:iCs/>
-        </w:rPr>
-        <w:t>herapeutic</w:t>
-      </w:r>
-      <w:proofErr w:type="spellEnd"/>
-      <w:r>
-        <w:rPr>
-          <w:i/>
-          <w:iCs/>
-        </w:rPr>
-        <w:t xml:space="preserve"> Chemical</w:t>
+        <w:t>herapeutic Chemical</w:t>
       </w:r>
       <w:r>
         <w:t>), mantenido por la Organización Mundial de la Salud [</w:t>
@@ -8673,7 +8648,6 @@
       <w:r>
         <w:t xml:space="preserve">ue destaca </w:t>
       </w:r>
-      <w:proofErr w:type="spellStart"/>
       <w:r>
         <w:rPr>
           <w:b/>
@@ -8695,7 +8669,6 @@
         </w:rPr>
         <w:t>cum</w:t>
       </w:r>
-      <w:proofErr w:type="spellEnd"/>
       <w:r>
         <w:t xml:space="preserve"> [</w:t>
       </w:r>
@@ -8868,7 +8841,6 @@
       <w:r>
         <w:t xml:space="preserve"> </w:t>
       </w:r>
-      <w:proofErr w:type="spellStart"/>
       <w:r>
         <w:rPr>
           <w:b/>
@@ -8876,7 +8848,6 @@
         </w:rPr>
         <w:t>DrugEquivalent</w:t>
       </w:r>
-      <w:proofErr w:type="spellEnd"/>
       <w:r>
         <w:t xml:space="preserve"> [</w:t>
       </w:r>
@@ -13044,7 +13015,6 @@
       <w:r>
         <w:t xml:space="preserve">la capa de interfaz emplea </w:t>
       </w:r>
-      <w:proofErr w:type="spellStart"/>
       <w:r>
         <w:rPr>
           <w:b/>
@@ -13052,7 +13022,6 @@
         </w:rPr>
         <w:t>SharedPreferences</w:t>
       </w:r>
-      <w:proofErr w:type="spellEnd"/>
       <w:r>
         <w:rPr>
           <w:b/>
@@ -14446,15 +14415,7 @@
         <w:t xml:space="preserve">Asimismo, </w:t>
       </w:r>
       <w:r>
-        <w:t xml:space="preserve">cuenta con operaciones avanzadas sobre </w:t>
-      </w:r>
-      <w:proofErr w:type="spellStart"/>
-      <w:r>
-        <w:t>arrays</w:t>
-      </w:r>
-      <w:proofErr w:type="spellEnd"/>
-      <w:r>
-        <w:t xml:space="preserve"> y un amplio ecosistema de controladores que facilitan su integración con Python [</w:t>
+        <w:t>cuenta con operaciones avanzadas sobre arrays y un amplio ecosistema de controladores que facilitan su integración con Python [</w:t>
       </w:r>
       <w:r>
         <w:fldChar w:fldCharType="begin"/>
@@ -15021,7 +14982,6 @@
         </w:rPr>
         <w:t xml:space="preserve">se ha desarrollado de forma nativa para Android en </w:t>
       </w:r>
-      <w:proofErr w:type="spellStart"/>
       <w:r>
         <w:rPr>
           <w:rFonts w:eastAsia="Garamond"/>
@@ -15030,7 +14990,6 @@
         </w:rPr>
         <w:t>Kotlin</w:t>
       </w:r>
-      <w:proofErr w:type="spellEnd"/>
       <w:r>
         <w:rPr>
           <w:rFonts w:eastAsia="Garamond"/>
@@ -15057,7 +15016,6 @@
         </w:rPr>
         <w:t xml:space="preserve">, su concisión y su soporte nativo de </w:t>
       </w:r>
-      <w:proofErr w:type="spellStart"/>
       <w:r>
         <w:rPr>
           <w:rFonts w:eastAsia="Garamond"/>
@@ -15066,7 +15024,6 @@
         </w:rPr>
         <w:t>corrutinas</w:t>
       </w:r>
-      <w:proofErr w:type="spellEnd"/>
       <w:r>
         <w:rPr>
           <w:rFonts w:eastAsia="Garamond"/>
@@ -15434,35 +15391,7 @@
               <w:rPr>
                 <w:rFonts w:eastAsia="Garamond"/>
               </w:rPr>
-              <w:t xml:space="preserve">. Define los </w:t>
-            </w:r>
-            <w:proofErr w:type="spellStart"/>
-            <w:r>
-              <w:rPr>
-                <w:rFonts w:eastAsia="Garamond"/>
-              </w:rPr>
-              <w:t>endpoints</w:t>
-            </w:r>
-            <w:proofErr w:type="spellEnd"/>
-            <w:r>
-              <w:rPr>
-                <w:rFonts w:eastAsia="Garamond"/>
-              </w:rPr>
-              <w:t xml:space="preserve"> de forma declarativa y se integra con </w:t>
-            </w:r>
-            <w:proofErr w:type="spellStart"/>
-            <w:r>
-              <w:rPr>
-                <w:rFonts w:eastAsia="Garamond"/>
-              </w:rPr>
-              <w:t>corrutinas</w:t>
-            </w:r>
-            <w:proofErr w:type="spellEnd"/>
-            <w:r>
-              <w:rPr>
-                <w:rFonts w:eastAsia="Garamond"/>
-              </w:rPr>
-              <w:t xml:space="preserve"> [</w:t>
+              <w:t>. Define los endpoints de forma declarativa y se integra con corrutinas [</w:t>
             </w:r>
             <w:r>
               <w:rPr>
@@ -15557,65 +15486,190 @@
                 <w:rFonts w:eastAsia="Garamond"/>
                 <w:lang w:val="es-ES"/>
               </w:rPr>
-              <w:t xml:space="preserve">Ofrece buena integración con Retrofit y Kotlin y más ligera que </w:t>
-            </w:r>
-            <w:proofErr w:type="spellStart"/>
+              <w:t>Ofrece buena integración con Retrofit y Kotlin y más ligera que Gson [</w:t>
+            </w:r>
+            <w:r>
+              <w:rPr>
+                <w:rFonts w:eastAsia="Garamond"/>
+              </w:rPr>
+              <w:fldChar w:fldCharType="begin"/>
+            </w:r>
+            <w:r>
+              <w:rPr>
+                <w:rFonts w:eastAsia="Garamond"/>
+              </w:rPr>
+              <w:instrText xml:space="preserve"> REF Moshi \h </w:instrText>
+            </w:r>
+            <w:r>
+              <w:rPr>
+                <w:rFonts w:eastAsia="Garamond"/>
+              </w:rPr>
+            </w:r>
+            <w:r>
+              <w:rPr>
+                <w:rFonts w:eastAsia="Garamond"/>
+              </w:rPr>
+              <w:fldChar w:fldCharType="separate"/>
+            </w:r>
+            <w:r>
+              <w:rPr>
+                <w:lang w:val="es-ES"/>
+              </w:rPr>
+              <w:t>15</w:t>
+            </w:r>
+            <w:r>
+              <w:rPr>
+                <w:rFonts w:eastAsia="Garamond"/>
+              </w:rPr>
+              <w:fldChar w:fldCharType="end"/>
+            </w:r>
             <w:r>
               <w:rPr>
                 <w:rFonts w:eastAsia="Garamond"/>
                 <w:lang w:val="es-ES"/>
               </w:rPr>
-              <w:t>Gson</w:t>
-            </w:r>
-            <w:proofErr w:type="spellEnd"/>
-            <w:r>
+              <w:t>].</w:t>
+            </w:r>
+          </w:p>
+        </w:tc>
+      </w:tr>
+      <w:tr>
+        <w:tc>
+          <w:tcPr>
+            <w:tcW w:w="2376" w:type="dxa"/>
+            <w:shd w:val="clear" w:color="auto" w:fill="C6D9F1" w:themeFill="text2" w:themeFillTint="33"/>
+          </w:tcPr>
+          <w:p>
+            <w:pPr>
+              <w:spacing w:line="276" w:lineRule="auto"/>
+              <w:rPr>
+                <w:rFonts w:eastAsia="Garamond"/>
+                <w:b/>
+                <w:bCs/>
+              </w:rPr>
+            </w:pPr>
+            <w:r>
+              <w:rPr>
+                <w:rFonts w:eastAsia="Garamond"/>
+                <w:b/>
+                <w:bCs/>
+              </w:rPr>
+              <w:t>Room</w:t>
+            </w:r>
+          </w:p>
+        </w:tc>
+        <w:tc>
+          <w:tcPr>
+            <w:tcW w:w="6118" w:type="dxa"/>
+          </w:tcPr>
+          <w:p>
+            <w:pPr>
+              <w:spacing w:line="276" w:lineRule="auto"/>
+              <w:rPr>
+                <w:rFonts w:eastAsia="Garamond"/>
+              </w:rPr>
+            </w:pPr>
+            <w:r>
+              <w:rPr>
+                <w:rFonts w:eastAsia="Garamond"/>
+              </w:rPr>
+              <w:t xml:space="preserve">Persistencia </w:t>
+            </w:r>
+            <w:r>
+              <w:rPr>
+                <w:rFonts w:eastAsia="Garamond"/>
+              </w:rPr>
+              <w:t>local sobre SQLite (medicamentos guardados). Permite la verificación de consultas en compilación y menos código repetitivo [</w:t>
+            </w:r>
+            <w:r>
+              <w:rPr>
+                <w:rFonts w:eastAsia="Garamond"/>
+              </w:rPr>
+              <w:fldChar w:fldCharType="begin"/>
+            </w:r>
+            <w:r>
+              <w:rPr>
+                <w:rFonts w:eastAsia="Garamond"/>
+              </w:rPr>
+              <w:instrText xml:space="preserve"> REF Room \h </w:instrText>
+            </w:r>
+            <w:r>
+              <w:rPr>
+                <w:rFonts w:eastAsia="Garamond"/>
+              </w:rPr>
+            </w:r>
+            <w:r>
+              <w:rPr>
+                <w:rFonts w:eastAsia="Garamond"/>
+              </w:rPr>
+              <w:fldChar w:fldCharType="separate"/>
+            </w:r>
+            <w:r>
+              <w:rPr>
+                <w:lang w:val="es-ES"/>
+              </w:rPr>
+              <w:t>16</w:t>
+            </w:r>
+            <w:r>
+              <w:rPr>
+                <w:rFonts w:eastAsia="Garamond"/>
+              </w:rPr>
+              <w:fldChar w:fldCharType="end"/>
+            </w:r>
+            <w:r>
+              <w:rPr>
+                <w:rFonts w:eastAsia="Garamond"/>
+              </w:rPr>
+              <w:t>].</w:t>
+            </w:r>
+          </w:p>
+        </w:tc>
+      </w:tr>
+      <w:tr>
+        <w:tc>
+          <w:tcPr>
+            <w:tcW w:w="2376" w:type="dxa"/>
+            <w:shd w:val="clear" w:color="auto" w:fill="C6D9F1" w:themeFill="text2" w:themeFillTint="33"/>
+          </w:tcPr>
+          <w:p>
+            <w:pPr>
+              <w:spacing w:line="276" w:lineRule="auto"/>
+              <w:rPr>
+                <w:rFonts w:eastAsia="Garamond"/>
+                <w:b/>
+                <w:bCs/>
+                <w:lang w:val="es-ES"/>
+              </w:rPr>
+            </w:pPr>
+            <w:r>
+              <w:rPr>
+                <w:rFonts w:eastAsia="Garamond"/>
+                <w:b/>
+                <w:bCs/>
+                <w:lang w:val="es-ES"/>
+              </w:rPr>
+              <w:t>AndroidX Navigation</w:t>
+            </w:r>
+          </w:p>
+        </w:tc>
+        <w:tc>
+          <w:tcPr>
+            <w:tcW w:w="6118" w:type="dxa"/>
+          </w:tcPr>
+          <w:p>
+            <w:pPr>
+              <w:spacing w:line="276" w:lineRule="auto"/>
               <w:rPr>
                 <w:rFonts w:eastAsia="Garamond"/>
                 <w:lang w:val="es-ES"/>
               </w:rPr>
-              <w:t xml:space="preserve"> [</w:t>
-            </w:r>
-            <w:r>
-              <w:rPr>
-                <w:rFonts w:eastAsia="Garamond"/>
-              </w:rPr>
-              <w:fldChar w:fldCharType="begin"/>
-            </w:r>
-            <w:r>
-              <w:rPr>
-                <w:rFonts w:eastAsia="Garamond"/>
-              </w:rPr>
-              <w:instrText xml:space="preserve"> REF Moshi \h </w:instrText>
-            </w:r>
-            <w:r>
-              <w:rPr>
-                <w:rFonts w:eastAsia="Garamond"/>
-              </w:rPr>
-            </w:r>
-            <w:r>
-              <w:rPr>
-                <w:rFonts w:eastAsia="Garamond"/>
-              </w:rPr>
-              <w:fldChar w:fldCharType="separate"/>
-            </w:r>
-            <w:r>
-              <w:rPr>
-                <w:lang w:val="es-ES"/>
-              </w:rPr>
-              <w:t>15</w:t>
-            </w:r>
-            <w:r>
-              <w:rPr>
-                <w:rFonts w:eastAsia="Garamond"/>
-              </w:rPr>
-              <w:fldChar w:fldCharType="end"/>
-            </w:r>
+            </w:pPr>
             <w:r>
               <w:rPr>
                 <w:rFonts w:eastAsia="Garamond"/>
                 <w:lang w:val="es-ES"/>
               </w:rPr>
-              <w:t>].</w:t>
+              <w:t>Navegación entre fragmentos y paso seguro de argumentos (Safe Args).</w:t>
             </w:r>
           </w:p>
         </w:tc>
@@ -15633,6 +15687,7 @@
                 <w:rFonts w:eastAsia="Garamond"/>
                 <w:b/>
                 <w:bCs/>
+                <w:lang w:val="es-ES"/>
               </w:rPr>
             </w:pPr>
             <w:r>
@@ -15640,8 +15695,9 @@
                 <w:rFonts w:eastAsia="Garamond"/>
                 <w:b/>
                 <w:bCs/>
-              </w:rPr>
-              <w:t>Room</w:t>
+                <w:lang w:val="es-ES"/>
+              </w:rPr>
+              <w:t>ViewModel/Lifecycle</w:t>
             </w:r>
           </w:p>
         </w:tc>
@@ -15660,54 +15716,7 @@
               <w:rPr>
                 <w:rFonts w:eastAsia="Garamond"/>
               </w:rPr>
-              <w:t xml:space="preserve">Persistencia </w:t>
-            </w:r>
-            <w:r>
-              <w:rPr>
-                <w:rFonts w:eastAsia="Garamond"/>
-              </w:rPr>
-              <w:t>local sobre SQLite (medicamentos guardados). Permite la verificación de consultas en compilación y menos código repetitivo [</w:t>
-            </w:r>
-            <w:r>
-              <w:rPr>
-                <w:rFonts w:eastAsia="Garamond"/>
-              </w:rPr>
-              <w:fldChar w:fldCharType="begin"/>
-            </w:r>
-            <w:r>
-              <w:rPr>
-                <w:rFonts w:eastAsia="Garamond"/>
-              </w:rPr>
-              <w:instrText xml:space="preserve"> REF Room \h </w:instrText>
-            </w:r>
-            <w:r>
-              <w:rPr>
-                <w:rFonts w:eastAsia="Garamond"/>
-              </w:rPr>
-            </w:r>
-            <w:r>
-              <w:rPr>
-                <w:rFonts w:eastAsia="Garamond"/>
-              </w:rPr>
-              <w:fldChar w:fldCharType="separate"/>
-            </w:r>
-            <w:r>
-              <w:rPr>
-                <w:lang w:val="es-ES"/>
-              </w:rPr>
-              <w:t>16</w:t>
-            </w:r>
-            <w:r>
-              <w:rPr>
-                <w:rFonts w:eastAsia="Garamond"/>
-              </w:rPr>
-              <w:fldChar w:fldCharType="end"/>
-            </w:r>
-            <w:r>
-              <w:rPr>
-                <w:rFonts w:eastAsia="Garamond"/>
-              </w:rPr>
-              <w:t>].</w:t>
+              <w:t>Mantiene el estado de la UI y sobrevive a cambios de configuración.</w:t>
             </w:r>
           </w:p>
         </w:tc>
@@ -15735,7 +15744,7 @@
                 <w:bCs/>
                 <w:lang w:val="es-ES"/>
               </w:rPr>
-              <w:t>AndroidX Navigation</w:t>
+              <w:t>Material Components</w:t>
             </w:r>
           </w:p>
         </w:tc>
@@ -15756,7 +15765,7 @@
                 <w:rFonts w:eastAsia="Garamond"/>
                 <w:lang w:val="es-ES"/>
               </w:rPr>
-              <w:t>Navegación entre fragmentos y paso seguro de argumentos (Safe Args).</w:t>
+              <w:t xml:space="preserve">Componentes de Material Design (buscador, chips, bottom sheets, tema claro/oscuro). </w:t>
             </w:r>
           </w:p>
         </w:tc>
@@ -15774,102 +15783,6 @@
                 <w:rFonts w:eastAsia="Garamond"/>
                 <w:b/>
                 <w:bCs/>
-                <w:lang w:val="es-ES"/>
-              </w:rPr>
-            </w:pPr>
-            <w:r>
-              <w:rPr>
-                <w:rFonts w:eastAsia="Garamond"/>
-                <w:b/>
-                <w:bCs/>
-                <w:lang w:val="es-ES"/>
-              </w:rPr>
-              <w:t>ViewModel/Lifecycle</w:t>
-            </w:r>
-          </w:p>
-        </w:tc>
-        <w:tc>
-          <w:tcPr>
-            <w:tcW w:w="6118" w:type="dxa"/>
-          </w:tcPr>
-          <w:p>
-            <w:pPr>
-              <w:spacing w:line="276" w:lineRule="auto"/>
-              <w:rPr>
-                <w:rFonts w:eastAsia="Garamond"/>
-              </w:rPr>
-            </w:pPr>
-            <w:r>
-              <w:rPr>
-                <w:rFonts w:eastAsia="Garamond"/>
-              </w:rPr>
-              <w:t>Mantiene el estado de la UI y sobrevive a cambios de configuración.</w:t>
-            </w:r>
-          </w:p>
-        </w:tc>
-      </w:tr>
-      <w:tr>
-        <w:tc>
-          <w:tcPr>
-            <w:tcW w:w="2376" w:type="dxa"/>
-            <w:shd w:val="clear" w:color="auto" w:fill="C6D9F1" w:themeFill="text2" w:themeFillTint="33"/>
-          </w:tcPr>
-          <w:p>
-            <w:pPr>
-              <w:spacing w:line="276" w:lineRule="auto"/>
-              <w:rPr>
-                <w:rFonts w:eastAsia="Garamond"/>
-                <w:b/>
-                <w:bCs/>
-                <w:lang w:val="es-ES"/>
-              </w:rPr>
-            </w:pPr>
-            <w:r>
-              <w:rPr>
-                <w:rFonts w:eastAsia="Garamond"/>
-                <w:b/>
-                <w:bCs/>
-                <w:lang w:val="es-ES"/>
-              </w:rPr>
-              <w:t>Material Components</w:t>
-            </w:r>
-          </w:p>
-        </w:tc>
-        <w:tc>
-          <w:tcPr>
-            <w:tcW w:w="6118" w:type="dxa"/>
-          </w:tcPr>
-          <w:p>
-            <w:pPr>
-              <w:spacing w:line="276" w:lineRule="auto"/>
-              <w:rPr>
-                <w:rFonts w:eastAsia="Garamond"/>
-                <w:lang w:val="es-ES"/>
-              </w:rPr>
-            </w:pPr>
-            <w:r>
-              <w:rPr>
-                <w:rFonts w:eastAsia="Garamond"/>
-                <w:lang w:val="es-ES"/>
-              </w:rPr>
-              <w:t xml:space="preserve">Componentes de Material Design (buscador, chips, bottom sheets, tema claro/oscuro). </w:t>
-            </w:r>
-          </w:p>
-        </w:tc>
-      </w:tr>
-      <w:tr>
-        <w:tc>
-          <w:tcPr>
-            <w:tcW w:w="2376" w:type="dxa"/>
-            <w:shd w:val="clear" w:color="auto" w:fill="C6D9F1" w:themeFill="text2" w:themeFillTint="33"/>
-          </w:tcPr>
-          <w:p>
-            <w:pPr>
-              <w:spacing w:line="276" w:lineRule="auto"/>
-              <w:rPr>
-                <w:rFonts w:eastAsia="Garamond"/>
-                <w:b/>
-                <w:bCs/>
               </w:rPr>
             </w:pPr>
             <w:r>
@@ -15935,32 +15848,96 @@
     </w:p>
     <w:p>
       <w:pPr>
+        <w:pStyle w:val="Ttulo2"/>
         <w:rPr>
           <w:rFonts w:eastAsia="Garamond"/>
         </w:rPr>
       </w:pPr>
-    </w:p>
-    <w:p>
-      <w:pPr>
-        <w:pStyle w:val="Ttulo2"/>
+      <w:bookmarkStart w:id="59" w:name="_Toc233587017"/>
+      <w:r>
         <w:rPr>
           <w:rFonts w:eastAsia="Garamond"/>
         </w:rPr>
-      </w:pPr>
-      <w:bookmarkStart w:id="59" w:name="_Toc233587017"/>
+        <w:lastRenderedPageBreak/>
+        <w:t xml:space="preserve">6.4 </w:t>
+      </w:r>
       <w:r>
         <w:rPr>
           <w:rFonts w:eastAsia="Garamond"/>
         </w:rPr>
-        <w:t xml:space="preserve">6.4 </w:t>
-      </w:r>
-      <w:r>
+        <w:t>Integración de Productos de Terceros y Herramientas</w:t>
+      </w:r>
+      <w:bookmarkEnd w:id="59"/>
+    </w:p>
+    <w:p>
+      <w:pPr>
+        <w:pStyle w:val="Listado"/>
         <w:rPr>
           <w:rFonts w:eastAsia="Garamond"/>
         </w:rPr>
-        <w:t>Integración de Productos de Terceros y Herramientas</w:t>
-      </w:r>
-      <w:bookmarkEnd w:id="59"/>
+      </w:pPr>
+      <w:r>
+        <w:rPr>
+          <w:rFonts w:eastAsia="Garamond"/>
+          <w:b/>
+          <w:bCs w:val="0"/>
+        </w:rPr>
+        <w:t>Fuentes de datos externos</w:t>
+      </w:r>
+      <w:r>
+        <w:rPr>
+          <w:rFonts w:eastAsia="Garamond"/>
+        </w:rPr>
+        <w:t>. El catálogo se nutre de productos</w:t>
+      </w:r>
+      <w:r>
+        <w:rPr>
+          <w:rFonts w:eastAsia="Garamond"/>
+        </w:rPr>
+        <w:t xml:space="preserve"> de terceros</w:t>
+      </w:r>
+      <w:r>
+        <w:rPr>
+          <w:rFonts w:eastAsia="Garamond"/>
+        </w:rPr>
+        <w:t>,</w:t>
+      </w:r>
+      <w:r>
+        <w:rPr>
+          <w:rFonts w:eastAsia="Garamond"/>
+        </w:rPr>
+        <w:t xml:space="preserve"> </w:t>
+      </w:r>
+      <w:r>
+        <w:rPr>
+          <w:rFonts w:eastAsia="Garamond"/>
+        </w:rPr>
+        <w:t>l</w:t>
+      </w:r>
+      <w:r>
+        <w:rPr>
+          <w:rFonts w:eastAsia="Garamond"/>
+        </w:rPr>
+        <w:t>as bases de datos y APIs oficiales de las agencias regulador</w:t>
+      </w:r>
+      <w:r>
+        <w:rPr>
+          <w:rFonts w:eastAsia="Garamond"/>
+        </w:rPr>
+        <w:t>a</w:t>
+      </w:r>
+      <w:r>
+        <w:rPr>
+          <w:rFonts w:eastAsia="Garamond"/>
+        </w:rPr>
+        <w:t>s (CIMA/AEMPS, ISPCh, INFARMED, Health Canada, openFDA y RxNorm)</w:t>
+      </w:r>
+      <w:r>
+        <w:rPr>
+          <w:rFonts w:eastAsia="Garamond"/>
+        </w:rPr>
+        <w:t>.</w:t>
+      </w:r>
     </w:p>
     <w:p>
       <w:pPr>
@@ -15975,61 +15952,143 @@
           <w:b/>
           <w:bCs w:val="0"/>
         </w:rPr>
-        <w:t>Fuentes de datos externos</w:t>
+        <w:t>Render</w:t>
       </w:r>
       <w:r>
         <w:rPr>
           <w:rFonts w:eastAsia="Garamond"/>
         </w:rPr>
-        <w:t>. El catálogo se nutre de productos</w:t>
+        <w:t>.</w:t>
       </w:r>
       <w:r>
         <w:rPr>
           <w:rFonts w:eastAsia="Garamond"/>
         </w:rPr>
-        <w:t xml:space="preserve"> de terceros</w:t>
+        <w:t xml:space="preserve"> Plataforma PaaS donde se </w:t>
       </w:r>
       <w:r>
         <w:rPr>
           <w:rFonts w:eastAsia="Garamond"/>
         </w:rPr>
-        <w:t>,</w:t>
+        <w:t xml:space="preserve">aloja la </w:t>
       </w:r>
       <w:r>
         <w:rPr>
           <w:rFonts w:eastAsia="Garamond"/>
         </w:rPr>
+        <w:t xml:space="preserve">infraestructura del backend, tanto la </w:t>
+      </w:r>
+      <w:r>
+        <w:rPr>
+          <w:rFonts w:eastAsia="Garamond"/>
+          <w:b/>
+          <w:bCs w:val="0"/>
+        </w:rPr>
+        <w:t>API</w:t>
+      </w:r>
+      <w:r>
+        <w:rPr>
+          <w:rFonts w:eastAsia="Garamond"/>
+        </w:rPr>
+        <w:t xml:space="preserve"> (desplegada como servicio web) como la </w:t>
+      </w:r>
+      <w:r>
+        <w:rPr>
+          <w:rFonts w:eastAsia="Garamond"/>
+          <w:b/>
+          <w:bCs w:val="0"/>
+        </w:rPr>
+        <w:t>base de datos</w:t>
+      </w:r>
+      <w:r>
+        <w:rPr>
+          <w:rFonts w:eastAsia="Garamond"/>
+        </w:rPr>
+        <w:t xml:space="preserve"> PostgreSQL. Se eligió por su </w:t>
+      </w:r>
+      <w:r>
+        <w:rPr>
+          <w:rFonts w:eastAsia="Garamond"/>
+          <w:b/>
+          <w:bCs w:val="0"/>
+        </w:rPr>
+        <w:t>despliegue sencillo desde Git</w:t>
+      </w:r>
+      <w:r>
+        <w:rPr>
+          <w:rFonts w:eastAsia="Garamond"/>
+        </w:rPr>
+        <w:t xml:space="preserve"> y por ofrecer una </w:t>
+      </w:r>
+      <w:r>
+        <w:rPr>
+          <w:rFonts w:eastAsia="Garamond"/>
+          <w:b/>
+          <w:bCs w:val="0"/>
+        </w:rPr>
+        <w:t>base de datos gestionada</w:t>
+      </w:r>
+      <w:r>
+        <w:rPr>
+          <w:rFonts w:eastAsia="Garamond"/>
+        </w:rPr>
+        <w:t xml:space="preserve">. La aplicación </w:t>
+      </w:r>
+      <w:r>
+        <w:rPr>
+          <w:rFonts w:eastAsia="Garamond"/>
+        </w:rPr>
+        <w:t>móvil consume la API desplegada sobre HTTPS</w:t>
+      </w:r>
+      <w:r>
+        <w:rPr>
+          <w:rFonts w:eastAsia="Garamond"/>
+        </w:rPr>
         <w:t xml:space="preserve"> </w:t>
       </w:r>
       <w:r>
         <w:rPr>
           <w:rFonts w:eastAsia="Garamond"/>
         </w:rPr>
-        <w:t>l</w:t>
+        <w:t>[</w:t>
       </w:r>
       <w:r>
         <w:rPr>
           <w:rFonts w:eastAsia="Garamond"/>
         </w:rPr>
-        <w:t>as bases de datos y APIs oficiales de las agencias regulador</w:t>
+        <w:fldChar w:fldCharType="begin"/>
       </w:r>
       <w:r>
         <w:rPr>
           <w:rFonts w:eastAsia="Garamond"/>
         </w:rPr>
-        <w:t>a</w:t>
+        <w:instrText xml:space="preserve"> REF Render \h </w:instrText>
       </w:r>
       <w:r>
         <w:rPr>
           <w:rFonts w:eastAsia="Garamond"/>
         </w:rPr>
-        <w:t>s (CIMA/AEMPS, ISPCh, INFARMED, Health Canada, openFDA y RxNorm)</w:t>
       </w:r>
       <w:r>
         <w:rPr>
           <w:rFonts w:eastAsia="Garamond"/>
         </w:rPr>
-        <w:t>.</w:t>
+        <w:fldChar w:fldCharType="separate"/>
+      </w:r>
+      <w:r>
+        <w:t>17</w:t>
+      </w:r>
+      <w:r>
+        <w:rPr>
+          <w:rFonts w:eastAsia="Garamond"/>
+        </w:rPr>
+        <w:fldChar w:fldCharType="end"/>
+      </w:r>
+      <w:r>
+        <w:rPr>
+          <w:rFonts w:eastAsia="Garamond"/>
+        </w:rPr>
+        <w:t>].</w:t>
       </w:r>
     </w:p>
     <w:p>
@@ -16045,195 +16104,61 @@
           <w:b/>
           <w:bCs w:val="0"/>
         </w:rPr>
-        <w:t>Render</w:t>
+        <w:t>Herramientas de Desarrollo</w:t>
       </w:r>
       <w:r>
         <w:rPr>
           <w:rFonts w:eastAsia="Garamond"/>
         </w:rPr>
-        <w:t>.</w:t>
+        <w:t>:</w:t>
       </w:r>
       <w:r>
         <w:rPr>
           <w:rFonts w:eastAsia="Garamond"/>
         </w:rPr>
-        <w:t xml:space="preserve"> Plataforma PaaS donde se </w:t>
+        <w:t xml:space="preserve"> Android Studio, Visual Studio Code, Git y GitHub (control de versiones), Visual Paradigm y Draw.io (modelado UML</w:t>
       </w:r>
       <w:r>
         <w:rPr>
           <w:rFonts w:eastAsia="Garamond"/>
         </w:rPr>
-        <w:t xml:space="preserve">aloja la </w:t>
+        <w:t xml:space="preserve"> y diagramas</w:t>
       </w:r>
       <w:r>
         <w:rPr>
           <w:rFonts w:eastAsia="Garamond"/>
         </w:rPr>
-        <w:t xml:space="preserve">infraestructura del backend, tanto la </w:t>
+        <w:t>)</w:t>
       </w:r>
       <w:r>
         <w:rPr>
           <w:rFonts w:eastAsia="Garamond"/>
-          <w:b/>
-          <w:bCs w:val="0"/>
-        </w:rPr>
-        <w:t>API</w:t>
+        </w:rPr>
+        <w:t xml:space="preserve">, Gantt Project (diagrama de Gantt) </w:t>
       </w:r>
       <w:r>
         <w:rPr>
           <w:rFonts w:eastAsia="Garamond"/>
         </w:rPr>
-        <w:t xml:space="preserve"> (desplegada como servicio web) como la </w:t>
+        <w:t>y Gradle (construcción).</w:t>
       </w:r>
       <w:r>
         <w:rPr>
           <w:rFonts w:eastAsia="Garamond"/>
-          <w:b/>
-          <w:bCs w:val="0"/>
-        </w:rPr>
-        <w:t>base de datos</w:t>
+        </w:rPr>
+        <w:t xml:space="preserve"> Para las pruebas automatizadas de la API se empleó </w:t>
+      </w:r>
+      <w:r>
+        <w:rPr>
+          <w:rStyle w:val="CodeTextCar"/>
+        </w:rPr>
+        <w:t>pytest</w:t>
       </w:r>
       <w:r>
         <w:rPr>
           <w:rFonts w:eastAsia="Garamond"/>
         </w:rPr>
-        <w:t xml:space="preserve"> PostgreSQL. Se eligió por su </w:t>
-      </w:r>
-      <w:r>
-        <w:rPr>
-          <w:rFonts w:eastAsia="Garamond"/>
-          <w:b/>
-          <w:bCs w:val="0"/>
-        </w:rPr>
-        <w:t>despliegue sencillo desde Git</w:t>
-      </w:r>
-      <w:r>
-        <w:rPr>
-          <w:rFonts w:eastAsia="Garamond"/>
-        </w:rPr>
-        <w:t xml:space="preserve"> y por ofrecer una </w:t>
-      </w:r>
-      <w:r>
-        <w:rPr>
-          <w:rFonts w:eastAsia="Garamond"/>
-          <w:b/>
-          <w:bCs w:val="0"/>
-        </w:rPr>
-        <w:t>base de datos gestionada</w:t>
-      </w:r>
-      <w:r>
-        <w:rPr>
-          <w:rFonts w:eastAsia="Garamond"/>
-        </w:rPr>
-        <w:t xml:space="preserve">. La aplicación </w:t>
-      </w:r>
-      <w:r>
-        <w:rPr>
-          <w:rFonts w:eastAsia="Garamond"/>
-        </w:rPr>
-        <w:t>móvil consume la API desplegada sobre HTTPS</w:t>
-      </w:r>
-      <w:r>
-        <w:rPr>
-          <w:rFonts w:eastAsia="Garamond"/>
-        </w:rPr>
-        <w:t xml:space="preserve"> </w:t>
-      </w:r>
-      <w:r>
-        <w:rPr>
-          <w:rFonts w:eastAsia="Garamond"/>
-        </w:rPr>
-        <w:t>[</w:t>
-      </w:r>
-      <w:r>
-        <w:rPr>
-          <w:rFonts w:eastAsia="Garamond"/>
-        </w:rPr>
-        <w:fldChar w:fldCharType="begin"/>
-      </w:r>
-      <w:r>
-        <w:rPr>
-          <w:rFonts w:eastAsia="Garamond"/>
-        </w:rPr>
-        <w:instrText xml:space="preserve"> REF Render \h </w:instrText>
-      </w:r>
-      <w:r>
-        <w:rPr>
-          <w:rFonts w:eastAsia="Garamond"/>
-        </w:rPr>
-      </w:r>
-      <w:r>
-        <w:rPr>
-          <w:rFonts w:eastAsia="Garamond"/>
-        </w:rPr>
-        <w:fldChar w:fldCharType="separate"/>
-      </w:r>
-      <w:r>
-        <w:t>17</w:t>
-      </w:r>
-      <w:r>
-        <w:rPr>
-          <w:rFonts w:eastAsia="Garamond"/>
-        </w:rPr>
-        <w:fldChar w:fldCharType="end"/>
-      </w:r>
-      <w:r>
-        <w:rPr>
-          <w:rFonts w:eastAsia="Garamond"/>
-        </w:rPr>
-        <w:t>].</w:t>
-      </w:r>
-    </w:p>
-    <w:p>
-      <w:pPr>
-        <w:pStyle w:val="Listado"/>
-        <w:rPr>
-          <w:rFonts w:eastAsia="Garamond"/>
-        </w:rPr>
-      </w:pPr>
-      <w:r>
-        <w:rPr>
-          <w:rFonts w:eastAsia="Garamond"/>
-          <w:b/>
-          <w:bCs w:val="0"/>
-        </w:rPr>
-        <w:t>Herramientas de Desarrollo</w:t>
-      </w:r>
-      <w:r>
-        <w:rPr>
-          <w:rFonts w:eastAsia="Garamond"/>
-        </w:rPr>
-        <w:t>:</w:t>
-      </w:r>
-      <w:r>
-        <w:rPr>
-          <w:rFonts w:eastAsia="Garamond"/>
-        </w:rPr>
-        <w:t xml:space="preserve"> Android Studio, Visual Studio Code, Git y GitHub (control de versiones), Visual Paradigm y Draw.io (modelado UML</w:t>
-      </w:r>
-      <w:r>
-        <w:rPr>
-          <w:rFonts w:eastAsia="Garamond"/>
-        </w:rPr>
-        <w:t xml:space="preserve"> y diagramas</w:t>
-      </w:r>
-      <w:r>
-        <w:rPr>
-          <w:rFonts w:eastAsia="Garamond"/>
-        </w:rPr>
-        <w:t>)</w:t>
-      </w:r>
-      <w:r>
-        <w:rPr>
-          <w:rFonts w:eastAsia="Garamond"/>
-        </w:rPr>
-        <w:t xml:space="preserve">, Gantt Project (diagrama de Gantt) </w:t>
-      </w:r>
-      <w:r>
-        <w:rPr>
-          <w:rFonts w:eastAsia="Garamond"/>
-        </w:rPr>
-        <w:t>y Gradle (construcción).</w:t>
+        <w:t xml:space="preserve">. </w:t>
       </w:r>
     </w:p>
     <w:p>
@@ -17563,6 +17488,20 @@
                 <w:lang w:val="en-US"/>
               </w:rPr>
               <w:t>Gantt Project</w:t>
+            </w:r>
+            <w:r>
+              <w:rPr>
+                <w:rFonts w:eastAsia="Garamond"/>
+                <w:lang w:val="en-US"/>
+              </w:rPr>
+              <w:t xml:space="preserve">, </w:t>
+            </w:r>
+            <w:r>
+              <w:rPr>
+                <w:rStyle w:val="CodeTextCar"/>
+                <w:lang w:val="en-US"/>
+              </w:rPr>
+              <w:t>pytest</w:t>
             </w:r>
             <w:r>
               <w:rPr>
@@ -22842,7 +22781,7 @@
           <w:color w:val="000000"/>
         </w:rPr>
         <w:drawing>
-          <wp:inline distT="0" distB="0" distL="0" distR="0" wp14:anchorId="6A230931" wp14:editId="13B790BF">
+          <wp:inline distT="0" distB="0" distL="0" distR="0" wp14:anchorId="6A230931" wp14:editId="32BB28FC">
             <wp:extent cx="5346357" cy="2210457"/>
             <wp:effectExtent l="0" t="0" r="6985" b="0"/>
             <wp:docPr id="1846581174" name="Imagen 2"/>
@@ -27758,7 +27697,6 @@
       <w:r>
         <w:t xml:space="preserve">el </w:t>
       </w:r>
-      <w:proofErr w:type="spellStart"/>
       <w:r>
         <w:rPr>
           <w:b/>
@@ -27766,7 +27704,6 @@
         </w:rPr>
         <w:t>ISPCh</w:t>
       </w:r>
-      <w:proofErr w:type="spellEnd"/>
       <w:r>
         <w:t xml:space="preserve"> en Chile [</w:t>
       </w:r>
@@ -27864,7 +27801,6 @@
       <w:r>
         <w:t xml:space="preserve">] y, en Estados Unidos, </w:t>
       </w:r>
-      <w:proofErr w:type="spellStart"/>
       <w:r>
         <w:rPr>
           <w:b/>
@@ -27872,11 +27808,9 @@
         </w:rPr>
         <w:t>openFDA</w:t>
       </w:r>
-      <w:proofErr w:type="spellEnd"/>
       <w:r>
         <w:t xml:space="preserve"> junto con </w:t>
       </w:r>
-      <w:proofErr w:type="spellStart"/>
       <w:r>
         <w:rPr>
           <w:b/>
@@ -27884,7 +27818,6 @@
         </w:rPr>
         <w:t>RxNorm</w:t>
       </w:r>
-      <w:proofErr w:type="spellEnd"/>
       <w:r>
         <w:t xml:space="preserve"> [</w:t>
       </w:r>
@@ -30139,7 +30072,1149 @@
         <w:t>10.3 Pruebas de la API</w:t>
       </w:r>
     </w:p>
-    <w:p/>
+    <w:p>
+      <w:pPr>
+        <w:spacing w:after="240" w:line="276" w:lineRule="auto"/>
+      </w:pPr>
+      <w:r>
+        <w:t xml:space="preserve">La API se ha verificado de </w:t>
+      </w:r>
+      <w:r>
+        <w:rPr>
+          <w:u w:val="single"/>
+        </w:rPr>
+        <w:t>dos formas complementarias</w:t>
+      </w:r>
+      <w:r>
+        <w:t xml:space="preserve">: de </w:t>
+      </w:r>
+      <w:r>
+        <w:rPr>
+          <w:b/>
+          <w:bCs/>
+        </w:rPr>
+        <w:t>forma interactiva mediante la interfaz Swagger</w:t>
+      </w:r>
+      <w:r>
+        <w:t xml:space="preserve"> que genera FastAPI, y mediante una </w:t>
+      </w:r>
+      <w:r>
+        <w:rPr>
+          <w:b/>
+          <w:bCs/>
+        </w:rPr>
+        <w:t>suite de pruebas automatizadas</w:t>
+      </w:r>
+      <w:r>
+        <w:t xml:space="preserve"> desarrollada con </w:t>
+      </w:r>
+      <w:r>
+        <w:rPr>
+          <w:rStyle w:val="CodeTextCar"/>
+        </w:rPr>
+        <w:t>pytest</w:t>
+      </w:r>
+      <w:r>
+        <w:t xml:space="preserve"> y el </w:t>
+      </w:r>
+      <w:r>
+        <w:rPr>
+          <w:rStyle w:val="CodeTextCar"/>
+        </w:rPr>
+        <w:t>TestClient</w:t>
+      </w:r>
+      <w:r>
+        <w:t xml:space="preserve"> de FastAPI, que ejecuta las peticiones directamente sobre la aplicación.</w:t>
+      </w:r>
+    </w:p>
+    <w:p>
+      <w:pPr>
+        <w:spacing w:after="240" w:line="276" w:lineRule="auto"/>
+      </w:pPr>
+      <w:r>
+        <w:t xml:space="preserve">La suite consta de </w:t>
+      </w:r>
+      <w:r>
+        <w:rPr>
+          <w:b/>
+          <w:bCs/>
+        </w:rPr>
+        <w:t>20</w:t>
+      </w:r>
+      <w:r>
+        <w:rPr>
+          <w:b/>
+          <w:bCs/>
+        </w:rPr>
+        <w:t xml:space="preserve"> pruebas</w:t>
+      </w:r>
+      <w:r>
+        <w:t xml:space="preserve"> que </w:t>
+      </w:r>
+      <w:r>
+        <w:t>abarcan la búsqueda de medicamentos, el detalle y las equivalencias</w:t>
+      </w:r>
+      <w:r>
+        <w:t xml:space="preserve"> y</w:t>
+      </w:r>
+      <w:r>
+        <w:t xml:space="preserve"> todas </w:t>
+      </w:r>
+      <w:r>
+        <w:t>se ejecutan</w:t>
+      </w:r>
+      <w:r>
+        <w:t xml:space="preserve"> correctamente. Entre ellas destacan las que validan el puente para países sin ATC y las equivalencias entre idiomas distintos, que comprueban el núcleo del sistema. La </w:t>
+      </w:r>
+      <w:r>
+        <w:rPr>
+          <w:i/>
+          <w:iCs/>
+        </w:rPr>
+        <w:t>Tabla 10.3</w:t>
+      </w:r>
+      <w:r>
+        <w:t xml:space="preserve"> relaciona todas las pruebas</w:t>
+      </w:r>
+      <w:r>
+        <w:t xml:space="preserve"> implementadas </w:t>
+      </w:r>
+      <w:r>
+        <w:t xml:space="preserve">en </w:t>
+      </w:r>
+      <w:r>
+        <w:rPr>
+          <w:rStyle w:val="CodeTextCar"/>
+          <w:b/>
+          <w:bCs/>
+        </w:rPr>
+        <w:t>modulo_api/tests/test_api.py</w:t>
+      </w:r>
+      <w:r>
+        <w:t>.</w:t>
+      </w:r>
+    </w:p>
+    <w:tbl>
+      <w:tblPr>
+        <w:tblStyle w:val="Tablaconcuadrcula"/>
+        <w:tblW w:w="0" w:type="auto"/>
+        <w:tblLayout w:type="fixed"/>
+        <w:tblLook w:val="04A0" w:firstRow="1" w:lastRow="0" w:firstColumn="1" w:lastColumn="0" w:noHBand="0" w:noVBand="1"/>
+      </w:tblPr>
+      <w:tblGrid>
+        <w:gridCol w:w="5098"/>
+        <w:gridCol w:w="3396"/>
+      </w:tblGrid>
+      <w:tr>
+        <w:tc>
+          <w:tcPr>
+            <w:tcW w:w="5098" w:type="dxa"/>
+            <w:shd w:val="clear" w:color="auto" w:fill="0F243E" w:themeFill="text2" w:themeFillShade="80"/>
+          </w:tcPr>
+          <w:p>
+            <w:pPr>
+              <w:spacing w:line="276" w:lineRule="auto"/>
+              <w:rPr>
+                <w:b/>
+                <w:bCs/>
+              </w:rPr>
+            </w:pPr>
+            <w:r>
+              <w:rPr>
+                <w:b/>
+                <w:bCs/>
+              </w:rPr>
+              <w:t>Prueba</w:t>
+            </w:r>
+          </w:p>
+        </w:tc>
+        <w:tc>
+          <w:tcPr>
+            <w:tcW w:w="3396" w:type="dxa"/>
+            <w:shd w:val="clear" w:color="auto" w:fill="0F243E" w:themeFill="text2" w:themeFillShade="80"/>
+          </w:tcPr>
+          <w:p>
+            <w:pPr>
+              <w:spacing w:line="276" w:lineRule="auto"/>
+              <w:rPr>
+                <w:b/>
+                <w:bCs/>
+              </w:rPr>
+            </w:pPr>
+            <w:r>
+              <w:rPr>
+                <w:b/>
+                <w:bCs/>
+              </w:rPr>
+              <w:t>Comprueba</w:t>
+            </w:r>
+          </w:p>
+        </w:tc>
+      </w:tr>
+      <w:tr>
+        <w:tc>
+          <w:tcPr>
+            <w:tcW w:w="5098" w:type="dxa"/>
+            <w:shd w:val="clear" w:color="auto" w:fill="C6D9F1" w:themeFill="text2" w:themeFillTint="33"/>
+          </w:tcPr>
+          <w:p>
+            <w:pPr>
+              <w:pStyle w:val="CodeText"/>
+              <w:spacing w:after="0"/>
+              <w:rPr>
+                <w:b/>
+                <w:bCs/>
+              </w:rPr>
+            </w:pPr>
+            <w:r>
+              <w:rPr>
+                <w:b/>
+                <w:bCs/>
+              </w:rPr>
+              <w:t>test_buscar_modo_nombre</w:t>
+            </w:r>
+          </w:p>
+        </w:tc>
+        <w:tc>
+          <w:tcPr>
+            <w:tcW w:w="3396" w:type="dxa"/>
+          </w:tcPr>
+          <w:p>
+            <w:pPr>
+              <w:spacing w:line="276" w:lineRule="auto"/>
+              <w:jc w:val="left"/>
+            </w:pPr>
+            <w:r>
+              <w:t>Búsqueda por nombre comercial</w:t>
+            </w:r>
+          </w:p>
+        </w:tc>
+      </w:tr>
+      <w:tr>
+        <w:tc>
+          <w:tcPr>
+            <w:tcW w:w="5098" w:type="dxa"/>
+            <w:shd w:val="clear" w:color="auto" w:fill="C6D9F1" w:themeFill="text2" w:themeFillTint="33"/>
+          </w:tcPr>
+          <w:p>
+            <w:pPr>
+              <w:pStyle w:val="CodeText"/>
+              <w:spacing w:after="0"/>
+              <w:rPr>
+                <w:b/>
+                <w:bCs/>
+              </w:rPr>
+            </w:pPr>
+            <w:r>
+              <w:rPr>
+                <w:b/>
+                <w:bCs/>
+              </w:rPr>
+              <w:t>test_buscar_modo_principio_activo</w:t>
+            </w:r>
+          </w:p>
+        </w:tc>
+        <w:tc>
+          <w:tcPr>
+            <w:tcW w:w="3396" w:type="dxa"/>
+          </w:tcPr>
+          <w:p>
+            <w:pPr>
+              <w:spacing w:line="276" w:lineRule="auto"/>
+              <w:jc w:val="left"/>
+            </w:pPr>
+            <w:r>
+              <w:t>Búsqueda por principio activo</w:t>
+            </w:r>
+          </w:p>
+        </w:tc>
+      </w:tr>
+      <w:tr>
+        <w:tc>
+          <w:tcPr>
+            <w:tcW w:w="5098" w:type="dxa"/>
+            <w:shd w:val="clear" w:color="auto" w:fill="C6D9F1" w:themeFill="text2" w:themeFillTint="33"/>
+          </w:tcPr>
+          <w:p>
+            <w:pPr>
+              <w:pStyle w:val="CodeText"/>
+              <w:spacing w:after="0"/>
+              <w:rPr>
+                <w:b/>
+                <w:bCs/>
+              </w:rPr>
+            </w:pPr>
+            <w:r>
+              <w:rPr>
+                <w:b/>
+                <w:bCs/>
+              </w:rPr>
+              <w:t>test_buscar_modo_atc</w:t>
+            </w:r>
+          </w:p>
+        </w:tc>
+        <w:tc>
+          <w:tcPr>
+            <w:tcW w:w="3396" w:type="dxa"/>
+          </w:tcPr>
+          <w:p>
+            <w:pPr>
+              <w:spacing w:line="276" w:lineRule="auto"/>
+              <w:jc w:val="left"/>
+            </w:pPr>
+            <w:r>
+              <w:t>Búsqueda por código ATC</w:t>
+            </w:r>
+          </w:p>
+        </w:tc>
+      </w:tr>
+      <w:tr>
+        <w:tc>
+          <w:tcPr>
+            <w:tcW w:w="5098" w:type="dxa"/>
+            <w:shd w:val="clear" w:color="auto" w:fill="C6D9F1" w:themeFill="text2" w:themeFillTint="33"/>
+          </w:tcPr>
+          <w:p>
+            <w:pPr>
+              <w:pStyle w:val="CodeText"/>
+              <w:spacing w:after="0"/>
+              <w:rPr>
+                <w:b/>
+                <w:bCs/>
+              </w:rPr>
+            </w:pPr>
+            <w:r>
+              <w:rPr>
+                <w:b/>
+                <w:bCs/>
+              </w:rPr>
+              <w:t>test_buscar_modo_registro</w:t>
+            </w:r>
+          </w:p>
+        </w:tc>
+        <w:tc>
+          <w:tcPr>
+            <w:tcW w:w="3396" w:type="dxa"/>
+          </w:tcPr>
+          <w:p>
+            <w:pPr>
+              <w:spacing w:line="276" w:lineRule="auto"/>
+              <w:jc w:val="left"/>
+            </w:pPr>
+            <w:r>
+              <w:t>Búsqueda por número de registro</w:t>
+            </w:r>
+          </w:p>
+        </w:tc>
+      </w:tr>
+      <w:tr>
+        <w:tc>
+          <w:tcPr>
+            <w:tcW w:w="5098" w:type="dxa"/>
+            <w:shd w:val="clear" w:color="auto" w:fill="C6D9F1" w:themeFill="text2" w:themeFillTint="33"/>
+          </w:tcPr>
+          <w:p>
+            <w:pPr>
+              <w:pStyle w:val="CodeText"/>
+              <w:spacing w:after="0"/>
+              <w:rPr>
+                <w:b/>
+                <w:bCs/>
+              </w:rPr>
+            </w:pPr>
+            <w:r>
+              <w:rPr>
+                <w:b/>
+                <w:bCs/>
+              </w:rPr>
+              <w:t>test_buscar_modo_todo</w:t>
+            </w:r>
+          </w:p>
+        </w:tc>
+        <w:tc>
+          <w:tcPr>
+            <w:tcW w:w="3396" w:type="dxa"/>
+          </w:tcPr>
+          <w:p>
+            <w:pPr>
+              <w:spacing w:line="276" w:lineRule="auto"/>
+              <w:jc w:val="left"/>
+            </w:pPr>
+            <w:r>
+              <w:t xml:space="preserve">Búsqueda </w:t>
+            </w:r>
+            <w:r>
+              <w:t>general</w:t>
+            </w:r>
+            <w:r>
+              <w:t xml:space="preserve"> por cualquiera de los criterios</w:t>
+            </w:r>
+          </w:p>
+        </w:tc>
+      </w:tr>
+      <w:tr>
+        <w:tc>
+          <w:tcPr>
+            <w:tcW w:w="5098" w:type="dxa"/>
+            <w:shd w:val="clear" w:color="auto" w:fill="C6D9F1" w:themeFill="text2" w:themeFillTint="33"/>
+          </w:tcPr>
+          <w:p>
+            <w:pPr>
+              <w:pStyle w:val="CodeText"/>
+              <w:spacing w:after="0"/>
+              <w:rPr>
+                <w:b/>
+                <w:bCs/>
+              </w:rPr>
+            </w:pPr>
+            <w:r>
+              <w:rPr>
+                <w:b/>
+                <w:bCs/>
+              </w:rPr>
+              <w:t>test_buscar_filtro_pais</w:t>
+            </w:r>
+          </w:p>
+        </w:tc>
+        <w:tc>
+          <w:tcPr>
+            <w:tcW w:w="3396" w:type="dxa"/>
+          </w:tcPr>
+          <w:p>
+            <w:pPr>
+              <w:spacing w:line="276" w:lineRule="auto"/>
+              <w:jc w:val="left"/>
+            </w:pPr>
+            <w:r>
+              <w:t>Filtro por país</w:t>
+            </w:r>
+          </w:p>
+        </w:tc>
+      </w:tr>
+      <w:tr>
+        <w:tc>
+          <w:tcPr>
+            <w:tcW w:w="5098" w:type="dxa"/>
+            <w:shd w:val="clear" w:color="auto" w:fill="C6D9F1" w:themeFill="text2" w:themeFillTint="33"/>
+          </w:tcPr>
+          <w:p>
+            <w:pPr>
+              <w:pStyle w:val="CodeText"/>
+              <w:spacing w:after="0"/>
+              <w:rPr>
+                <w:b/>
+                <w:bCs/>
+              </w:rPr>
+            </w:pPr>
+            <w:r>
+              <w:rPr>
+                <w:b/>
+                <w:bCs/>
+              </w:rPr>
+              <w:lastRenderedPageBreak/>
+              <w:t>test_buscar_filtro_forma</w:t>
+            </w:r>
+          </w:p>
+        </w:tc>
+        <w:tc>
+          <w:tcPr>
+            <w:tcW w:w="3396" w:type="dxa"/>
+          </w:tcPr>
+          <w:p>
+            <w:pPr>
+              <w:spacing w:line="276" w:lineRule="auto"/>
+              <w:jc w:val="left"/>
+            </w:pPr>
+            <w:r>
+              <w:t>Filtro por forma farmacéutica</w:t>
+            </w:r>
+          </w:p>
+        </w:tc>
+      </w:tr>
+      <w:tr>
+        <w:tc>
+          <w:tcPr>
+            <w:tcW w:w="5098" w:type="dxa"/>
+            <w:shd w:val="clear" w:color="auto" w:fill="C6D9F1" w:themeFill="text2" w:themeFillTint="33"/>
+          </w:tcPr>
+          <w:p>
+            <w:pPr>
+              <w:pStyle w:val="CodeText"/>
+              <w:spacing w:after="0"/>
+              <w:rPr>
+                <w:b/>
+                <w:bCs/>
+              </w:rPr>
+            </w:pPr>
+            <w:r>
+              <w:rPr>
+                <w:b/>
+                <w:bCs/>
+              </w:rPr>
+              <w:t>test_buscar_filtro_</w:t>
+            </w:r>
+            <w:r>
+              <w:rPr>
+                <w:b/>
+                <w:bCs/>
+              </w:rPr>
+              <w:t>via</w:t>
+            </w:r>
+          </w:p>
+        </w:tc>
+        <w:tc>
+          <w:tcPr>
+            <w:tcW w:w="3396" w:type="dxa"/>
+          </w:tcPr>
+          <w:p>
+            <w:pPr>
+              <w:spacing w:line="276" w:lineRule="auto"/>
+              <w:jc w:val="left"/>
+            </w:pPr>
+            <w:r>
+              <w:t>Filtro por vía de administración</w:t>
+            </w:r>
+          </w:p>
+        </w:tc>
+      </w:tr>
+      <w:tr>
+        <w:tc>
+          <w:tcPr>
+            <w:tcW w:w="5098" w:type="dxa"/>
+            <w:shd w:val="clear" w:color="auto" w:fill="C6D9F1" w:themeFill="text2" w:themeFillTint="33"/>
+          </w:tcPr>
+          <w:p>
+            <w:pPr>
+              <w:pStyle w:val="CodeText"/>
+              <w:spacing w:after="0"/>
+              <w:rPr>
+                <w:b/>
+                <w:bCs/>
+              </w:rPr>
+            </w:pPr>
+            <w:r>
+              <w:rPr>
+                <w:b/>
+                <w:bCs/>
+              </w:rPr>
+              <w:t>test_buscar_filtro_</w:t>
+            </w:r>
+            <w:r>
+              <w:rPr>
+                <w:b/>
+                <w:bCs/>
+              </w:rPr>
+              <w:t>laboratorio</w:t>
+            </w:r>
+          </w:p>
+        </w:tc>
+        <w:tc>
+          <w:tcPr>
+            <w:tcW w:w="3396" w:type="dxa"/>
+          </w:tcPr>
+          <w:p>
+            <w:pPr>
+              <w:spacing w:line="276" w:lineRule="auto"/>
+              <w:jc w:val="left"/>
+            </w:pPr>
+            <w:r>
+              <w:t>Filtro por laboratorio fabricante</w:t>
+            </w:r>
+          </w:p>
+        </w:tc>
+      </w:tr>
+      <w:tr>
+        <w:tc>
+          <w:tcPr>
+            <w:tcW w:w="5098" w:type="dxa"/>
+            <w:shd w:val="clear" w:color="auto" w:fill="C6D9F1" w:themeFill="text2" w:themeFillTint="33"/>
+          </w:tcPr>
+          <w:p>
+            <w:pPr>
+              <w:pStyle w:val="CodeText"/>
+              <w:spacing w:after="0"/>
+              <w:rPr>
+                <w:b/>
+                <w:bCs/>
+              </w:rPr>
+            </w:pPr>
+            <w:r>
+              <w:rPr>
+                <w:b/>
+                <w:bCs/>
+              </w:rPr>
+              <w:t>test_buscar_</w:t>
+            </w:r>
+            <w:r>
+              <w:rPr>
+                <w:b/>
+                <w:bCs/>
+              </w:rPr>
+              <w:t>filtro_combinado</w:t>
+            </w:r>
+          </w:p>
+        </w:tc>
+        <w:tc>
+          <w:tcPr>
+            <w:tcW w:w="3396" w:type="dxa"/>
+          </w:tcPr>
+          <w:p>
+            <w:pPr>
+              <w:spacing w:line="276" w:lineRule="auto"/>
+              <w:jc w:val="left"/>
+            </w:pPr>
+            <w:r>
+              <w:t>Todos los filtros combinados</w:t>
+            </w:r>
+          </w:p>
+        </w:tc>
+      </w:tr>
+      <w:tr>
+        <w:tc>
+          <w:tcPr>
+            <w:tcW w:w="5098" w:type="dxa"/>
+            <w:shd w:val="clear" w:color="auto" w:fill="C6D9F1" w:themeFill="text2" w:themeFillTint="33"/>
+          </w:tcPr>
+          <w:p>
+            <w:pPr>
+              <w:pStyle w:val="CodeText"/>
+              <w:spacing w:after="0"/>
+              <w:rPr>
+                <w:b/>
+                <w:bCs/>
+              </w:rPr>
+            </w:pPr>
+            <w:r>
+              <w:rPr>
+                <w:b/>
+                <w:bCs/>
+              </w:rPr>
+              <w:t>test_buscar</w:t>
+            </w:r>
+            <w:r>
+              <w:rPr>
+                <w:b/>
+                <w:bCs/>
+              </w:rPr>
+              <w:t>_</w:t>
+            </w:r>
+            <w:r>
+              <w:rPr>
+                <w:b/>
+                <w:bCs/>
+              </w:rPr>
+              <w:t>longitud_minima</w:t>
+            </w:r>
+          </w:p>
+        </w:tc>
+        <w:tc>
+          <w:tcPr>
+            <w:tcW w:w="3396" w:type="dxa"/>
+          </w:tcPr>
+          <w:p>
+            <w:pPr>
+              <w:spacing w:line="276" w:lineRule="auto"/>
+              <w:jc w:val="left"/>
+              <w:rPr>
+                <w:u w:val="single"/>
+              </w:rPr>
+            </w:pPr>
+            <w:r>
+              <w:t>Validación de longitud mínima del término (Error 4</w:t>
+            </w:r>
+            <w:r>
+              <w:t>2</w:t>
+            </w:r>
+            <w:r>
+              <w:t>2)</w:t>
+            </w:r>
+          </w:p>
+        </w:tc>
+      </w:tr>
+      <w:tr>
+        <w:tc>
+          <w:tcPr>
+            <w:tcW w:w="5098" w:type="dxa"/>
+            <w:shd w:val="clear" w:color="auto" w:fill="C6D9F1" w:themeFill="text2" w:themeFillTint="33"/>
+          </w:tcPr>
+          <w:p>
+            <w:pPr>
+              <w:pStyle w:val="CodeText"/>
+              <w:spacing w:after="0"/>
+              <w:rPr>
+                <w:b/>
+                <w:bCs/>
+                <w:u w:val="single"/>
+              </w:rPr>
+            </w:pPr>
+            <w:r>
+              <w:rPr>
+                <w:b/>
+                <w:bCs/>
+              </w:rPr>
+              <w:t>test_buscar_</w:t>
+            </w:r>
+            <w:r>
+              <w:rPr>
+                <w:b/>
+                <w:bCs/>
+              </w:rPr>
+              <w:t>limit</w:t>
+            </w:r>
+          </w:p>
+        </w:tc>
+        <w:tc>
+          <w:tcPr>
+            <w:tcW w:w="3396" w:type="dxa"/>
+          </w:tcPr>
+          <w:p>
+            <w:pPr>
+              <w:spacing w:line="276" w:lineRule="auto"/>
+              <w:jc w:val="left"/>
+            </w:pPr>
+            <w:r>
+              <w:t>Límite de resultados</w:t>
+            </w:r>
+          </w:p>
+        </w:tc>
+      </w:tr>
+      <w:tr>
+        <w:tc>
+          <w:tcPr>
+            <w:tcW w:w="5098" w:type="dxa"/>
+            <w:shd w:val="clear" w:color="auto" w:fill="C6D9F1" w:themeFill="text2" w:themeFillTint="33"/>
+          </w:tcPr>
+          <w:p>
+            <w:pPr>
+              <w:pStyle w:val="CodeText"/>
+              <w:spacing w:after="0"/>
+              <w:rPr>
+                <w:b/>
+                <w:bCs/>
+              </w:rPr>
+            </w:pPr>
+            <w:r>
+              <w:rPr>
+                <w:b/>
+                <w:bCs/>
+              </w:rPr>
+              <w:t>test_detalle_</w:t>
+            </w:r>
+            <w:r>
+              <w:rPr>
+                <w:b/>
+                <w:bCs/>
+              </w:rPr>
+              <w:t>medicamento_existente</w:t>
+            </w:r>
+          </w:p>
+        </w:tc>
+        <w:tc>
+          <w:tcPr>
+            <w:tcW w:w="3396" w:type="dxa"/>
+          </w:tcPr>
+          <w:p>
+            <w:pPr>
+              <w:spacing w:line="276" w:lineRule="auto"/>
+              <w:jc w:val="left"/>
+            </w:pPr>
+            <w:r>
+              <w:t>Ficha de un medicamento existente</w:t>
+            </w:r>
+          </w:p>
+        </w:tc>
+      </w:tr>
+      <w:tr>
+        <w:tc>
+          <w:tcPr>
+            <w:tcW w:w="5098" w:type="dxa"/>
+            <w:shd w:val="clear" w:color="auto" w:fill="C6D9F1" w:themeFill="text2" w:themeFillTint="33"/>
+          </w:tcPr>
+          <w:p>
+            <w:pPr>
+              <w:pStyle w:val="CodeText"/>
+              <w:spacing w:after="0"/>
+              <w:rPr>
+                <w:b/>
+                <w:bCs/>
+              </w:rPr>
+            </w:pPr>
+            <w:r>
+              <w:rPr>
+                <w:b/>
+                <w:bCs/>
+              </w:rPr>
+              <w:t>test_detalle_medicamento_</w:t>
+            </w:r>
+            <w:r>
+              <w:rPr>
+                <w:b/>
+                <w:bCs/>
+              </w:rPr>
+              <w:t>in</w:t>
+            </w:r>
+            <w:r>
+              <w:rPr>
+                <w:b/>
+                <w:bCs/>
+              </w:rPr>
+              <w:t>existente</w:t>
+            </w:r>
+          </w:p>
+        </w:tc>
+        <w:tc>
+          <w:tcPr>
+            <w:tcW w:w="3396" w:type="dxa"/>
+          </w:tcPr>
+          <w:p>
+            <w:pPr>
+              <w:spacing w:line="276" w:lineRule="auto"/>
+              <w:jc w:val="left"/>
+            </w:pPr>
+            <w:r>
+              <w:t xml:space="preserve">Respuesta 404 ante </w:t>
+            </w:r>
+            <w:r>
+              <w:rPr>
+                <w:rStyle w:val="CodeTextCar"/>
+              </w:rPr>
+              <w:t>id_med</w:t>
+            </w:r>
+            <w:r>
+              <w:t xml:space="preserve"> inexistente</w:t>
+            </w:r>
+          </w:p>
+        </w:tc>
+      </w:tr>
+      <w:tr>
+        <w:tc>
+          <w:tcPr>
+            <w:tcW w:w="5098" w:type="dxa"/>
+            <w:shd w:val="clear" w:color="auto" w:fill="C6D9F1" w:themeFill="text2" w:themeFillTint="33"/>
+          </w:tcPr>
+          <w:p>
+            <w:pPr>
+              <w:pStyle w:val="CodeText"/>
+              <w:spacing w:after="0"/>
+              <w:rPr>
+                <w:b/>
+                <w:bCs/>
+              </w:rPr>
+            </w:pPr>
+            <w:r>
+              <w:rPr>
+                <w:b/>
+                <w:bCs/>
+              </w:rPr>
+              <w:t>test_</w:t>
+            </w:r>
+            <w:r>
+              <w:rPr>
+                <w:b/>
+                <w:bCs/>
+              </w:rPr>
+              <w:t>equivalencias_por_atc</w:t>
+            </w:r>
+          </w:p>
+        </w:tc>
+        <w:tc>
+          <w:tcPr>
+            <w:tcW w:w="3396" w:type="dxa"/>
+          </w:tcPr>
+          <w:p>
+            <w:pPr>
+              <w:spacing w:line="276" w:lineRule="auto"/>
+              <w:jc w:val="left"/>
+            </w:pPr>
+            <w:r>
+              <w:t>Equivalencias por código ATC</w:t>
+            </w:r>
+          </w:p>
+        </w:tc>
+      </w:tr>
+      <w:tr>
+        <w:tc>
+          <w:tcPr>
+            <w:tcW w:w="5098" w:type="dxa"/>
+            <w:shd w:val="clear" w:color="auto" w:fill="C6D9F1" w:themeFill="text2" w:themeFillTint="33"/>
+          </w:tcPr>
+          <w:p>
+            <w:pPr>
+              <w:pStyle w:val="CodeText"/>
+              <w:spacing w:after="0"/>
+              <w:rPr>
+                <w:b/>
+                <w:bCs/>
+              </w:rPr>
+            </w:pPr>
+            <w:r>
+              <w:rPr>
+                <w:b/>
+                <w:bCs/>
+              </w:rPr>
+              <w:t>test_equivalencias_por_</w:t>
+            </w:r>
+            <w:r>
+              <w:rPr>
+                <w:b/>
+                <w:bCs/>
+              </w:rPr>
+              <w:t>p</w:t>
+            </w:r>
+            <w:r>
+              <w:rPr>
+                <w:b/>
+                <w:bCs/>
+              </w:rPr>
+              <w:t>a</w:t>
+            </w:r>
+          </w:p>
+        </w:tc>
+        <w:tc>
+          <w:tcPr>
+            <w:tcW w:w="3396" w:type="dxa"/>
+          </w:tcPr>
+          <w:p>
+            <w:pPr>
+              <w:spacing w:line="276" w:lineRule="auto"/>
+              <w:jc w:val="left"/>
+            </w:pPr>
+            <w:r>
+              <w:t>Equivalencias por principio activo</w:t>
+            </w:r>
+          </w:p>
+        </w:tc>
+      </w:tr>
+      <w:tr>
+        <w:tc>
+          <w:tcPr>
+            <w:tcW w:w="5098" w:type="dxa"/>
+            <w:shd w:val="clear" w:color="auto" w:fill="C6D9F1" w:themeFill="text2" w:themeFillTint="33"/>
+          </w:tcPr>
+          <w:p>
+            <w:pPr>
+              <w:pStyle w:val="CodeText"/>
+              <w:spacing w:after="0"/>
+              <w:rPr>
+                <w:b/>
+                <w:bCs/>
+              </w:rPr>
+            </w:pPr>
+            <w:r>
+              <w:rPr>
+                <w:b/>
+                <w:bCs/>
+              </w:rPr>
+              <w:t>test_equivalencias_</w:t>
+            </w:r>
+            <w:r>
+              <w:rPr>
+                <w:b/>
+                <w:bCs/>
+              </w:rPr>
+              <w:t>puente_pa</w:t>
+            </w:r>
+            <w:r>
+              <w:rPr>
+                <w:b/>
+                <w:bCs/>
+              </w:rPr>
+              <w:t>_cl</w:t>
+            </w:r>
+          </w:p>
+        </w:tc>
+        <w:tc>
+          <w:tcPr>
+            <w:tcW w:w="3396" w:type="dxa"/>
+          </w:tcPr>
+          <w:p>
+            <w:pPr>
+              <w:spacing w:line="276" w:lineRule="auto"/>
+              <w:jc w:val="left"/>
+            </w:pPr>
+            <w:r>
+              <w:t>Puente para países sin código ATC (caso de Chile)</w:t>
+            </w:r>
+          </w:p>
+        </w:tc>
+      </w:tr>
+      <w:tr>
+        <w:tc>
+          <w:tcPr>
+            <w:tcW w:w="5098" w:type="dxa"/>
+            <w:shd w:val="clear" w:color="auto" w:fill="C6D9F1" w:themeFill="text2" w:themeFillTint="33"/>
+          </w:tcPr>
+          <w:p>
+            <w:pPr>
+              <w:pStyle w:val="CodeText"/>
+              <w:spacing w:after="0"/>
+              <w:rPr>
+                <w:b/>
+                <w:bCs/>
+              </w:rPr>
+            </w:pPr>
+            <w:r>
+              <w:rPr>
+                <w:b/>
+                <w:bCs/>
+              </w:rPr>
+              <w:t>test_equivalencias_puente_pa_pt</w:t>
+            </w:r>
+          </w:p>
+        </w:tc>
+        <w:tc>
+          <w:tcPr>
+            <w:tcW w:w="3396" w:type="dxa"/>
+          </w:tcPr>
+          <w:p>
+            <w:pPr>
+              <w:spacing w:line="276" w:lineRule="auto"/>
+              <w:jc w:val="left"/>
+            </w:pPr>
+            <w:r>
+              <w:t xml:space="preserve">Puente para países sin código ATC (caso de </w:t>
+            </w:r>
+            <w:r>
+              <w:t>Portugal</w:t>
+            </w:r>
+            <w:r>
+              <w:t>)</w:t>
+            </w:r>
+          </w:p>
+        </w:tc>
+      </w:tr>
+      <w:tr>
+        <w:tc>
+          <w:tcPr>
+            <w:tcW w:w="5098" w:type="dxa"/>
+            <w:shd w:val="clear" w:color="auto" w:fill="C6D9F1" w:themeFill="text2" w:themeFillTint="33"/>
+          </w:tcPr>
+          <w:p>
+            <w:pPr>
+              <w:pStyle w:val="CodeText"/>
+              <w:spacing w:after="0"/>
+              <w:rPr>
+                <w:b/>
+                <w:bCs/>
+              </w:rPr>
+            </w:pPr>
+            <w:r>
+              <w:rPr>
+                <w:b/>
+                <w:bCs/>
+              </w:rPr>
+              <w:t>test_equivalencias_</w:t>
+            </w:r>
+            <w:r>
+              <w:rPr>
+                <w:b/>
+                <w:bCs/>
+              </w:rPr>
+              <w:t>cross_idioma</w:t>
+            </w:r>
+          </w:p>
+        </w:tc>
+        <w:tc>
+          <w:tcPr>
+            <w:tcW w:w="3396" w:type="dxa"/>
+          </w:tcPr>
+          <w:p>
+            <w:pPr>
+              <w:spacing w:line="276" w:lineRule="auto"/>
+              <w:jc w:val="left"/>
+            </w:pPr>
+            <w:r>
+              <w:t>Equivalencias entre idiomas distintos (ES-CA/</w:t>
+            </w:r>
+            <w:r>
+              <w:t>EE.UU.</w:t>
+            </w:r>
+            <w:r>
+              <w:t>)</w:t>
+            </w:r>
+          </w:p>
+        </w:tc>
+      </w:tr>
+      <w:tr>
+        <w:tc>
+          <w:tcPr>
+            <w:tcW w:w="5098" w:type="dxa"/>
+            <w:shd w:val="clear" w:color="auto" w:fill="C6D9F1" w:themeFill="text2" w:themeFillTint="33"/>
+          </w:tcPr>
+          <w:p>
+            <w:pPr>
+              <w:pStyle w:val="CodeText"/>
+              <w:spacing w:after="0"/>
+              <w:rPr>
+                <w:b/>
+                <w:bCs/>
+                <w:u w:val="single"/>
+              </w:rPr>
+            </w:pPr>
+            <w:r>
+              <w:rPr>
+                <w:b/>
+                <w:bCs/>
+              </w:rPr>
+              <w:t>test_equivalencias_</w:t>
+            </w:r>
+            <w:r>
+              <w:rPr>
+                <w:b/>
+                <w:bCs/>
+              </w:rPr>
+              <w:t>filtro_destino</w:t>
+            </w:r>
+          </w:p>
+        </w:tc>
+        <w:tc>
+          <w:tcPr>
+            <w:tcW w:w="3396" w:type="dxa"/>
+          </w:tcPr>
+          <w:p>
+            <w:pPr>
+              <w:spacing w:line="276" w:lineRule="auto"/>
+              <w:jc w:val="left"/>
+            </w:pPr>
+            <w:r>
+              <w:t>Filtro por país de destino en equivalencias</w:t>
+            </w:r>
+          </w:p>
+        </w:tc>
+      </w:tr>
+    </w:tbl>
+    <w:p>
+      <w:pPr>
+        <w:pStyle w:val="Tablas"/>
+      </w:pPr>
+      <w:r>
+        <w:t xml:space="preserve">Tabla 10.3: </w:t>
+      </w:r>
+      <w:r>
+        <w:t>Pruebas automatizadas de la API</w:t>
+      </w:r>
+    </w:p>
+    <w:p>
+      <w:pPr>
+        <w:spacing w:line="276" w:lineRule="auto"/>
+      </w:pPr>
+      <w:r>
+        <w:t>La</w:t>
+      </w:r>
+      <w:r>
+        <w:t xml:space="preserve"> salida completa de la ejecución de las pruebas se recoge en el </w:t>
+      </w:r>
+      <w:r>
+        <w:rPr>
+          <w:i/>
+          <w:iCs/>
+        </w:rPr>
+        <w:t>Anexo C</w:t>
+      </w:r>
+      <w:r>
+        <w:t>.</w:t>
+      </w:r>
+    </w:p>
     <w:p>
       <w:pPr>
         <w:pStyle w:val="Ttulo2"/>
@@ -34779,6 +35854,7 @@
         <w:spacing w:line="276" w:lineRule="auto"/>
         <w:rPr>
           <w:u w:val="single"/>
+          <w:lang w:val="en-US"/>
         </w:rPr>
       </w:pPr>
       <w:r>
@@ -34786,12 +35862,14 @@
           <w:b/>
           <w:bCs/>
           <w:u w:val="single"/>
+          <w:lang w:val="en-US"/>
         </w:rPr>
         <w:t>Consulta 1</w:t>
       </w:r>
       <w:r>
         <w:rPr>
           <w:u w:val="single"/>
+          <w:lang w:val="en-US"/>
         </w:rPr>
         <w:t xml:space="preserve"> – Medicamentos por país:</w:t>
       </w:r>
@@ -35128,6 +36206,7 @@
           <w:color w:val="383A42"/>
           <w:sz w:val="16"/>
           <w:szCs w:val="16"/>
+          <w:lang w:val="en-US"/>
         </w:rPr>
         <w:t xml:space="preserve">    </w:t>
       </w:r>
@@ -35220,6 +36299,7 @@
         <w:spacing w:before="240" w:line="276" w:lineRule="auto"/>
         <w:rPr>
           <w:u w:val="single"/>
+          <w:lang w:val="en-US"/>
         </w:rPr>
       </w:pPr>
       <w:r>
@@ -35227,12 +36307,14 @@
           <w:b/>
           <w:bCs/>
           <w:u w:val="single"/>
+          <w:lang w:val="en-US"/>
         </w:rPr>
         <w:t>Consulta 2</w:t>
       </w:r>
       <w:r>
         <w:rPr>
           <w:u w:val="single"/>
+          <w:lang w:val="en-US"/>
         </w:rPr>
         <w:t xml:space="preserve"> – Totales generales:</w:t>
       </w:r>
@@ -35946,7 +37028,7 @@
           <w:color w:val="383A42"/>
           <w:sz w:val="16"/>
           <w:szCs w:val="16"/>
-          <w:lang w:val="es-ES"/>
+          <w:lang w:val="en-US"/>
         </w:rPr>
         <w:t xml:space="preserve"> </w:t>
       </w:r>
@@ -36171,6 +37253,7 @@
           <w:color w:val="383A42"/>
           <w:sz w:val="16"/>
           <w:szCs w:val="16"/>
+          <w:lang w:val="en-US"/>
         </w:rPr>
         <w:t xml:space="preserve">  </w:t>
       </w:r>
@@ -36421,6 +37504,9 @@
         <w:spacing w:line="276" w:lineRule="auto"/>
       </w:pPr>
       <w:r>
+        <w:rPr>
+          <w:noProof/>
+        </w:rPr>
         <w:drawing>
           <wp:inline distT="0" distB="0" distL="0" distR="0" wp14:anchorId="1CF8896D" wp14:editId="55D316C5">
             <wp:extent cx="5370590" cy="2981960"/>
@@ -36672,91 +37758,56 @@
                 <w:i/>
                 <w:iCs/>
               </w:rPr>
-              <w:t>“</w:t>
+              <w:t xml:space="preserve">“Ibuprofeno” </w:t>
+            </w:r>
+            <w:r>
+              <w:t>(origen Canadá)</w:t>
+            </w:r>
+            <w:r>
+              <w:t xml:space="preserve"> </w:t>
+            </w:r>
+            <w:r>
+              <w:t xml:space="preserve">no devuelve resultados para </w:t>
+            </w:r>
+            <w:r>
+              <w:t>Espa</w:t>
+            </w:r>
+            <w:r>
+              <w:t>ñ</w:t>
+            </w:r>
+            <w:r>
+              <w:t>a</w:t>
+            </w:r>
+            <w:r>
+              <w:t xml:space="preserve">, </w:t>
+            </w:r>
+            <w:r>
+              <w:t xml:space="preserve">ya </w:t>
+            </w:r>
+            <w:r>
+              <w:t xml:space="preserve">que </w:t>
+            </w:r>
+            <w:r>
+              <w:t xml:space="preserve">los datos canadienses usan </w:t>
+            </w:r>
+            <w:r>
+              <w:t>denominación</w:t>
+            </w:r>
+            <w:r>
+              <w:t xml:space="preserve"> ingl</w:t>
+            </w:r>
+            <w:r>
+              <w:t>esa</w:t>
+            </w:r>
+            <w:r>
+              <w:t xml:space="preserve"> </w:t>
             </w:r>
             <w:r>
               <w:rPr>
                 <w:i/>
                 <w:iCs/>
               </w:rPr>
-              <w:t>Ibuprofeno</w:t>
-            </w:r>
-            <w:r>
-              <w:rPr>
-                <w:i/>
-                <w:iCs/>
-              </w:rPr>
-              <w:t>”</w:t>
-            </w:r>
-            <w:r>
-              <w:rPr>
-                <w:i/>
-                <w:iCs/>
-              </w:rPr>
-              <w:t xml:space="preserve"> </w:t>
-            </w:r>
-            <w:r>
-              <w:t>(origen Canadá)</w:t>
-            </w:r>
-            <w:r>
-              <w:t xml:space="preserve"> </w:t>
-            </w:r>
-            <w:r>
-              <w:t xml:space="preserve">no devuelve resultados para </w:t>
-            </w:r>
-            <w:r>
-              <w:t>Espa</w:t>
-            </w:r>
-            <w:r>
-              <w:t>ñ</w:t>
-            </w:r>
-            <w:r>
-              <w:t>a</w:t>
-            </w:r>
-            <w:r>
-              <w:t xml:space="preserve">, </w:t>
-            </w:r>
-            <w:r>
-              <w:t xml:space="preserve">ya </w:t>
-            </w:r>
-            <w:r>
-              <w:t xml:space="preserve">que </w:t>
-            </w:r>
-            <w:r>
-              <w:t xml:space="preserve">los datos canadienses usan </w:t>
-            </w:r>
-            <w:r>
-              <w:t>denominación</w:t>
-            </w:r>
-            <w:r>
-              <w:t xml:space="preserve"> ingl</w:t>
-            </w:r>
-            <w:r>
-              <w:t>esa</w:t>
-            </w:r>
-            <w:r>
-              <w:t xml:space="preserve"> </w:t>
-            </w:r>
-            <w:r>
-              <w:rPr>
-                <w:i/>
-                <w:iCs/>
-              </w:rPr>
-              <w:t>“</w:t>
-            </w:r>
-            <w:r>
-              <w:rPr>
-                <w:i/>
-                <w:iCs/>
-              </w:rPr>
-              <w:t>Ibuprofen</w:t>
-            </w:r>
-            <w:r>
-              <w:rPr>
-                <w:i/>
-                <w:iCs/>
-              </w:rPr>
-              <w:t>”</w:t>
+              <w:t>“Ibuprofen”</w:t>
             </w:r>
             <w:r>
               <w:t>.</w:t>
@@ -36837,8 +37888,127 @@
         <w:t>Tabla C.1: Limitaciones de la búsqueda sobre datos en crudo y su resolución en el Backend</w:t>
       </w:r>
     </w:p>
+    <w:p>
+      <w:pPr>
+        <w:pStyle w:val="Ttulo3"/>
+      </w:pPr>
+      <w:r>
+        <w:lastRenderedPageBreak/>
+        <w:t>C.3 Pruebas Automatizadas de la API</w:t>
+      </w:r>
+    </w:p>
+    <w:p>
+      <w:pPr>
+        <w:spacing w:after="240" w:line="276" w:lineRule="auto"/>
+      </w:pPr>
+      <w:r>
+        <w:t>Salida de la ejecución de la suite de pruebas (</w:t>
+      </w:r>
+      <w:r>
+        <w:rPr>
+          <w:rStyle w:val="CodeTextCar"/>
+          <w:b/>
+          <w:bCs/>
+        </w:rPr>
+        <w:t>modulo_api/tests/test_api.py</w:t>
+      </w:r>
+      <w:r>
+        <w:t xml:space="preserve">), desarrollada con </w:t>
+      </w:r>
+      <w:r>
+        <w:rPr>
+          <w:rStyle w:val="CodeTextCar"/>
+        </w:rPr>
+        <w:t>pytest</w:t>
+      </w:r>
+      <w:r>
+        <w:t xml:space="preserve"> y el </w:t>
+      </w:r>
+      <w:r>
+        <w:rPr>
+          <w:rStyle w:val="CodeTextCar"/>
+        </w:rPr>
+        <w:t>TestClient</w:t>
+      </w:r>
+      <w:r>
+        <w:t xml:space="preserve"> de FastAPI. La </w:t>
+      </w:r>
+      <w:r>
+        <w:rPr>
+          <w:i/>
+          <w:iCs/>
+        </w:rPr>
+        <w:t>Figura C.2</w:t>
+      </w:r>
+      <w:r>
+        <w:t xml:space="preserve"> muestra el resultado: </w:t>
+      </w:r>
+      <w:r>
+        <w:rPr>
+          <w:b/>
+          <w:bCs/>
+        </w:rPr>
+        <w:t>las 20 pruebas se ejecutan correctamente</w:t>
+      </w:r>
+      <w:r>
+        <w:t>.</w:t>
+      </w:r>
+    </w:p>
+    <w:p>
+      <w:pPr>
+        <w:spacing w:line="276" w:lineRule="auto"/>
+      </w:pPr>
+      <w:r>
+        <w:drawing>
+          <wp:inline distT="0" distB="0" distL="0" distR="0" wp14:anchorId="1D07773F" wp14:editId="64EC3C5E">
+            <wp:extent cx="5400040" cy="2991485"/>
+            <wp:effectExtent l="0" t="0" r="0" b="0"/>
+            <wp:docPr id="1890646369" name="Imagen 1"/>
+            <wp:cNvGraphicFramePr>
+              <a:graphicFrameLocks xmlns:a="http://schemas.openxmlformats.org/drawingml/2006/main" noChangeAspect="1"/>
+            </wp:cNvGraphicFramePr>
+            <a:graphic xmlns:a="http://schemas.openxmlformats.org/drawingml/2006/main">
+              <a:graphicData uri="http://schemas.openxmlformats.org/drawingml/2006/picture">
+                <pic:pic xmlns:pic="http://schemas.openxmlformats.org/drawingml/2006/picture">
+                  <pic:nvPicPr>
+                    <pic:cNvPr id="1890646369" name=""/>
+                    <pic:cNvPicPr/>
+                  </pic:nvPicPr>
+                  <pic:blipFill>
+                    <a:blip r:embed="rId49"/>
+                    <a:stretch>
+                      <a:fillRect/>
+                    </a:stretch>
+                  </pic:blipFill>
+                  <pic:spPr>
+                    <a:xfrm>
+                      <a:off x="0" y="0"/>
+                      <a:ext cx="5400040" cy="2991485"/>
+                    </a:xfrm>
+                    <a:prstGeom prst="rect">
+                      <a:avLst/>
+                    </a:prstGeom>
+                  </pic:spPr>
+                </pic:pic>
+              </a:graphicData>
+            </a:graphic>
+          </wp:inline>
+        </w:drawing>
+      </w:r>
+    </w:p>
+    <w:p>
+      <w:pPr>
+        <w:pStyle w:val="Figuras"/>
+      </w:pPr>
+      <w:r>
+        <w:t xml:space="preserve">Figura C.2: </w:t>
+      </w:r>
+      <w:r>
+        <w:t xml:space="preserve">Ejecución de la suite de pruebas automatizadas de la API </w:t>
+      </w:r>
+    </w:p>
     <w:sectPr>
-      <w:footerReference w:type="first" r:id="rId49"/>
+      <w:footerReference w:type="first" r:id="rId50"/>
       <w:pgSz w:w="11906" w:h="16838"/>
       <w:pgMar w:top="1417" w:right="1701" w:bottom="1417" w:left="1701" w:header="567" w:footer="1133" w:gutter="0"/>
       <w:cols w:space="720"/>
@@ -41062,28 +42232,28 @@
 </file>
 
 <file path=customXml/item1.xml><?xml version="1.0" encoding="utf-8"?>
+<b:Sources xmlns:b="http://schemas.openxmlformats.org/officeDocument/2006/bibliography" xmlns="http://schemas.openxmlformats.org/officeDocument/2006/bibliography" SelectedStyle="\IEEE2006OfficeOnline.xsl" StyleName="IEEE" Version="2006"/>
+</file>
+
+<file path=customXml/item2.xml><?xml version="1.0" encoding="utf-8"?>
 <go:gDocsCustomXmlDataStorage xmlns:go="http://customooxmlschemas.google.com/" xmlns:r="http://schemas.openxmlformats.org/officeDocument/2006/relationships" uri="GoogleDocsCustomDataVersion2">
   <go:docsCustomData xmlns:go="http://customooxmlschemas.google.com/" roundtripDataSignature="AMtx7mjVHzTvG8r0JFDfCrhOioroDp5c8Q==">CgMxLjAyDmguajdna2FzYzFhYnV2Mg5oLjZwZGhlaGhieDBvczIOaC5pMDh1ZWhpenQ3cjYyDWgub2I5dnc0c2ZwMTkyDWgubHl1eXhqMGs0aTQyDmguaGs5ZGtkejk1NG90Mg5oLmRnd3V6N3MzNDc5MTIOaC5kOHo3aTJ6MmlueWoyDmguand3YXdtaHlvb2Z2Mg5oLnhwM25uNjZ5YzFuOTIOaC45cXpuc2o0dmt5aGoyDmguMXRzNTZsczgybDFyOAByITFWME9CR1NkWDZONUtEQmppczVjRlNhUDZIeFVhbXRPdQ==</go:docsCustomData>
 </go:gDocsCustomXmlDataStorage>
 </file>
 
-<file path=customXml/item2.xml><?xml version="1.0" encoding="utf-8"?>
-<b:Sources xmlns:b="http://schemas.openxmlformats.org/officeDocument/2006/bibliography" xmlns="http://schemas.openxmlformats.org/officeDocument/2006/bibliography" SelectedStyle="\IEEE2006OfficeOnline.xsl" StyleName="IEEE" Version="2006"/>
+<file path=customXml/itemProps1.xml><?xml version="1.0" encoding="utf-8"?>
+<ds:datastoreItem xmlns:ds="http://schemas.openxmlformats.org/officeDocument/2006/customXml" ds:itemID="{7C8FAD05-89E4-4C1B-A7B1-BCE27BE03F9D}">
+  <ds:schemaRefs>
+    <ds:schemaRef ds:uri="http://schemas.openxmlformats.org/officeDocument/2006/bibliography"/>
+  </ds:schemaRefs>
+</ds:datastoreItem>
 </file>
 
-<file path=customXml/itemProps1.xml><?xml version="1.0" encoding="utf-8"?>
+<file path=customXml/itemProps2.xml><?xml version="1.0" encoding="utf-8"?>
 <ds:datastoreItem xmlns:ds="http://schemas.openxmlformats.org/officeDocument/2006/customXml" ds:itemID="{11111111-1234-1234-1234-123412341234}">
   <ds:schemaRefs>
     <ds:schemaRef ds:uri="http://customooxmlschemas.google.com/"/>
     <ds:schemaRef ds:uri="http://schemas.openxmlformats.org/officeDocument/2006/relationships"/>
   </ds:schemaRefs>
 </ds:datastoreItem>
-</file>
-
-<file path=customXml/itemProps2.xml><?xml version="1.0" encoding="utf-8"?>
-<ds:datastoreItem xmlns:ds="http://schemas.openxmlformats.org/officeDocument/2006/customXml" ds:itemID="{7C8FAD05-89E4-4C1B-A7B1-BCE27BE03F9D}">
-  <ds:schemaRefs>
-    <ds:schemaRef ds:uri="http://schemas.openxmlformats.org/officeDocument/2006/bibliography"/>
-  </ds:schemaRefs>
-</ds:datastoreItem>
 </file>
</xml_diff>